<commit_message>
Interpreter added to main Word
</commit_message>
<xml_diff>
--- a/Design Patterns.docx
+++ b/Design Patterns.docx
@@ -849,7 +849,16 @@
           <w:szCs w:val="24"/>
           <w:lang w:bidi="fa-IR"/>
         </w:rPr>
-        <w:t>Strategy</w:t>
+        <w:t xml:space="preserve"> </w:t>
+      </w:r>
+      <w:r>
+        <w:rPr>
+          <w:rFonts w:ascii="Nunito" w:hAnsi="Nunito"/>
+          <w:sz w:val="24"/>
+          <w:szCs w:val="24"/>
+          <w:lang w:bidi="fa-IR"/>
+        </w:rPr>
+        <w:t>Interpreter</w:t>
       </w:r>
     </w:p>
     <w:p>
@@ -867,6 +876,15 @@
           <w:lang w:bidi="fa-IR"/>
         </w:rPr>
       </w:pPr>
+      <w:r>
+        <w:rPr>
+          <w:rFonts w:ascii="Nunito" w:hAnsi="Nunito"/>
+          <w:sz w:val="24"/>
+          <w:szCs w:val="24"/>
+          <w:lang w:bidi="fa-IR"/>
+        </w:rPr>
+        <w:t xml:space="preserve"> </w:t>
+      </w:r>
       <w:r>
         <w:rPr>
           <w:rFonts w:ascii="Nunito" w:hAnsi="Nunito"/>
@@ -2431,7 +2449,7 @@
   <w:abstractNum w:abstractNumId="12" w15:restartNumberingAfterBreak="0">
     <w:nsid w:val="70CE6A38"/>
     <w:multiLevelType w:val="hybridMultilevel"/>
-    <w:tmpl w:val="8E222A5E"/>
+    <w:tmpl w:val="18D27D88"/>
     <w:lvl w:ilvl="0" w:tplc="0409000F">
       <w:start w:val="1"/>
       <w:numFmt w:val="decimal"/>
@@ -3192,6 +3210,7 @@
   <w:style w:type="character" w:default="1" w:styleId="DefaultParagraphFont">
     <w:name w:val="Default Paragraph Font"/>
     <w:uiPriority w:val="1"/>
+    <w:semiHidden/>
     <w:unhideWhenUsed/>
   </w:style>
   <w:style w:type="table" w:default="1" w:styleId="TableNormal">

</xml_diff>